<commit_message>
Update project report to match current site
Co-Authored-By: Claude Opus 5.5 <noreply@anthropic.com>
Claude-Session: https://claude.ai/code/session_01PWSrX5UNJvmWZUCmWACvkF
</commit_message>
<xml_diff>
--- a/PlanetMatrix-Project-Report.docx
+++ b/PlanetMatrix-Project-Report.docx
@@ -45,7 +45,7 @@
           <w:sz w:val="24"/>
           <w:szCs w:val="24"/>
         </w:rPr>
-        <w:t xml:space="preserve">Project Report · COS10005 Web Development · Assignment 1</w:t>
+        <w:t xml:space="preserve">Project Report · Web Development Assignment 1</w:t>
       </w:r>
     </w:p>
     <w:p>
@@ -6120,7 +6120,7 @@
           <w:i/>
           <w:iCs/>
         </w:rPr>
-        <w:t xml:space="preserve">COS10005 Web Development: Assignment 1 brief, case study and PlantsData</w:t>
+        <w:t xml:space="preserve">Web Development Assignment 1: brief, case study and PlantsData</w:t>
       </w:r>
       <w:r>
         <w:t xml:space="preserve"> [Unit documents].</w:t>

</xml_diff>

<commit_message>
Move explorer sources to Acknowledgements, tidy HTML comments and spacing
Co-Authored-By: Claude Opus 5.5 <noreply@anthropic.com>
Claude-Session: https://claude.ai/code/session_01PWSrX5UNJvmWZUCmWACvkF
</commit_message>
<xml_diff>
--- a/PlanetMatrix-Project-Report.docx
+++ b/PlanetMatrix-Project-Report.docx
@@ -1681,7 +1681,7 @@
         <w:spacing w:after="140" w:line="300"/>
       </w:pPr>
       <w:r>
-        <w:t xml:space="preserve">The Families, Genera and Species pages follow the same pattern, which makes them easy to read. Each plant has its own boxed profile with a common name, a description in my own words, a link to its source, a list of quick facts such as origin and classification, a few tips on how to recognise it and a photo gallery. The pages are linked in both directions, so from a species you can jump up to its genus or family and back down again. Following the PlantsData document, I chose two families, two genera for each family and two species for each genus.</w:t>
+        <w:t xml:space="preserve">The Families, Genera and Species pages follow the same pattern, which makes them easy to read. Each plant has its own boxed profile with a common name, a description in my own words, a list of quick facts such as origin and classification, a few tips on how to recognise it and a photo gallery. The pages are linked in both directions, so from a species you can jump up to its genus or family and back down again. Following the PlantsData document, I chose two families, two genera for each family and two species for each genus.</w:t>
       </w:r>
     </w:p>
     <w:p>
@@ -2277,7 +2277,7 @@
         <w:t xml:space="preserve">Meta data and comments.</w:t>
       </w:r>
       <w:r>
-        <w:t xml:space="preserve"> Every page has a title, a character set, a viewport setting for phones, a description, keywords and an author, plus a header comment with my name, student ID and the file’s purpose.</w:t>
+        <w:t xml:space="preserve"> Every page has a title, a character set, a viewport setting for phones, a description, keywords and an author, plus a centred banner comment at the top with my name, student ID and the file’s purpose. Inside the page, each part has its own short, centred comment, such as “Search box with plant suggestions”, and blank lines separate the main blocks so the code is easy to read.</w:t>
       </w:r>
     </w:p>
     <w:p>
@@ -4865,7 +4865,7 @@
           <wp:inline distT="0" distB="0" distL="0" distR="0">
             <wp:extent cx="5715000" cy="4019550"/>
             <wp:effectExtent t="0" r="0" b="0" l="0"/>
-            <wp:docPr id="1" name="species.png" descr="A species profile with its description, source, quick facts and recognition tips." title="A species profile with its description, source, quick facts and recognition tips."/>
+            <wp:docPr id="1" name="species.png" descr="A species profile with its description, quick facts and recognition tips." title="A species profile with its description, quick facts and recognition tips."/>
             <wp:cNvGraphicFramePr>
               <a:graphicFrameLocks xmlns:a="http://schemas.openxmlformats.org/drawingml/2006/main" noChangeAspect="1"/>
             </wp:cNvGraphicFramePr>
@@ -4924,7 +4924,7 @@
           <w:sz w:val="19"/>
           <w:szCs w:val="19"/>
         </w:rPr>
-        <w:t xml:space="preserve">A species profile with its description, source, quick facts and recognition tips.</w:t>
+        <w:t xml:space="preserve">A species profile with its description, quick facts and recognition tips.</w:t>
       </w:r>
     </w:p>
     <w:p>
@@ -5312,7 +5312,7 @@
         <w:t xml:space="preserve">Honest about sources.</w:t>
       </w:r>
       <w:r>
-        <w:t xml:space="preserve"> Every description has a source link right after it, every gallery is credited, and the Acknowledgements page lists more than 150 credits.</w:t>
+        <w:t xml:space="preserve"> Every plant description, photo, font and picture is credited in one place, the Acknowledgements page, which lists more than 150 credits with links back to each source.</w:t>
       </w:r>
     </w:p>
     <w:p>

</xml_diff>

<commit_message>
Centre and reword CSS comments, restore plain HTML header comments
Co-Authored-By: Claude Opus 5.5 <noreply@anthropic.com>
Claude-Session: https://claude.ai/code/session_01PWSrX5UNJvmWZUCmWACvkF
</commit_message>
<xml_diff>
--- a/PlanetMatrix-Project-Report.docx
+++ b/PlanetMatrix-Project-Report.docx
@@ -2277,7 +2277,7 @@
         <w:t xml:space="preserve">Meta data and comments.</w:t>
       </w:r>
       <w:r>
-        <w:t xml:space="preserve"> Every page has a title, a character set, a viewport setting for phones, a description, keywords and an author, plus a centred banner comment at the top with my name, student ID and the file’s purpose. Inside the page, each part has its own short, centred comment, such as “Search box with plant suggestions”, and blank lines separate the main blocks so the code is easy to read.</w:t>
+        <w:t xml:space="preserve"> Every page has a title, a character set, a viewport setting for phones, a description, keywords and an author, plus a header comment at the top with my name, student ID and the file’s purpose. Inside the page, each part has its own short, centred comment, such as “Search box with plant suggestions”, and blank lines separate the main blocks so the code is easy to read.</w:t>
       </w:r>
     </w:p>
     <w:p>
@@ -3208,7 +3208,7 @@
         <w:t xml:space="preserve">styles/style.css</w:t>
       </w:r>
       <w:r>
-        <w:t xml:space="preserve">, which holds around 360 rules across 2,340 lines. It starts with a comment block explaining the file and the colour scheme, and every group of rules has a short comment, such as </w:t>
+        <w:t xml:space="preserve">, which holds around 360 rules across 2,340 lines. It starts with a comment block explaining the file and the colour scheme, and every group of rules has a short, centred comment in plain words, such as </w:t>
       </w:r>
       <w:r>
         <w:rPr>
@@ -3217,7 +3217,7 @@
           <w:sz w:val="20"/>
           <w:szCs w:val="20"/>
         </w:rPr>
-        <w:t xml:space="preserve">/* Header */</w:t>
+        <w:t xml:space="preserve">/* Stays at the top as you scroll */</w:t>
       </w:r>
       <w:r>
         <w:t xml:space="preserve"> or </w:t>
@@ -3229,10 +3229,10 @@
           <w:sz w:val="20"/>
           <w:szCs w:val="20"/>
         </w:rPr>
-        <w:t xml:space="preserve">/* Phones (700px and narrower) */</w:t>
-      </w:r>
-      <w:r>
-        <w:t xml:space="preserve">, so it’s easy to find your way around.</w:t>
+        <w:t xml:space="preserve">/* Phones (700px wide and narrower) */</w:t>
+      </w:r>
+      <w:r>
+        <w:t xml:space="preserve">. Blank lines separate the rules, so it’s easy to find your way around.</w:t>
       </w:r>
     </w:p>
     <w:p>

</xml_diff>

<commit_message>
Remove the forest audio player and its enhancement entry
Co-Authored-By: Claude Opus 5.5 <noreply@anthropic.com>
Claude-Session: https://claude.ai/code/session_01PWSrX5UNJvmWZUCmWACvkF
</commit_message>
<xml_diff>
--- a/PlanetMatrix-Project-Report.docx
+++ b/PlanetMatrix-Project-Report.docx
@@ -1465,7 +1465,7 @@
                 <w:sz w:val="20"/>
                 <w:szCs w:val="20"/>
               </w:rPr>
-              <w:t xml:space="preserve">My photo, details, a table about me, a forest soundscape and an email link.</w:t>
+              <w:t xml:space="preserve">My photo, details, a table about me and an email link.</w:t>
             </w:r>
           </w:p>
         </w:tc>
@@ -2233,19 +2233,7 @@
         <w:t xml:space="preserve">&lt;datalist&gt;</w:t>
       </w:r>
       <w:r>
-        <w:t xml:space="preserve"> gives search suggestions, </w:t>
-      </w:r>
-      <w:r>
-        <w:rPr>
-          <w:rFonts w:ascii="Consolas" w:cs="Consolas" w:eastAsia="Consolas" w:hAnsi="Consolas"/>
-          <w:color w:val="1F6E56"/>
-          <w:sz w:val="20"/>
-          <w:szCs w:val="20"/>
-        </w:rPr>
-        <w:t xml:space="preserve">&lt;audio&gt;</w:t>
-      </w:r>
-      <w:r>
-        <w:t xml:space="preserve"> plays the forest soundscape and an </w:t>
+        <w:t xml:space="preserve"> gives search suggestions and an </w:t>
       </w:r>
       <w:r>
         <w:rPr>
@@ -5783,7 +5771,7 @@
         <w:spacing w:after="140" w:line="300"/>
       </w:pPr>
       <w:r>
-        <w:t xml:space="preserve">Beyond the main four, the site has fifteen more enhancements. They include a star rating, picture and link hover effects, a Back to top button, the Google Map, the forest soundscape, CSS animations, expandable care tips, live form feedback, a site-map footer, search suggestions, phone-friendly pages, the link map diagram, the family comparison chart and custom fonts with the branded header. Appendix A lists them all, and each is explained on the Enhancements page.</w:t>
+        <w:t xml:space="preserve">Beyond the main four, the site has fourteen more enhancements. They include a star rating, picture and link hover effects, a Back to top button, the Google Map, CSS animations, expandable care tips, live form feedback, a site-map footer, search suggestions, phone-friendly pages, the link map diagram, the family comparison chart and custom fonts with the branded header. Appendix A lists them all, and each is explained on the Enhancements page.</w:t>
       </w:r>
     </w:p>
     <w:p>
@@ -5807,7 +5795,7 @@
         <w:spacing w:after="140" w:line="300"/>
       </w:pPr>
       <w:r>
-        <w:t xml:space="preserve">Pl@netMatrix brings the case study to life as a friendly, twelve-page website for exploring, identifying and recording Malaysia’s rare plants. The HTML is semantic, validated by the browser’s own form checks and completely separate from the styling. The CSS uses a wide range of selectors, a liquid layout that adapts to phones, and a calm green design. Nineteen enhancements, led by the hamburger menu, fixed navigation bar, photo lightbox and flip cards, make the site easier and more enjoyable to use, and every source is properly credited.</w:t>
+        <w:t xml:space="preserve">Pl@netMatrix brings the case study to life as a friendly, twelve-page website for exploring, identifying and recording Malaysia’s rare plants. The HTML is semantic, validated by the browser’s own form checks and completely separate from the styling. The CSS uses a wide range of selectors, a liquid layout that adapts to phones, and a calm green design. Eighteen enhancements, led by the hamburger menu, fixed navigation bar, photo lightbox and flip cards, make the site easier and more enjoyable to use, and every source is properly credited.</w:t>
       </w:r>
     </w:p>
     <w:p>
@@ -7145,7 +7133,7 @@
                 <w:sz w:val="20"/>
                 <w:szCs w:val="20"/>
               </w:rPr>
-              <w:t xml:space="preserve">Music and audio</w:t>
+              <w:t xml:space="preserve">CSS animations</w:t>
             </w:r>
           </w:p>
         </w:tc>
@@ -7171,7 +7159,7 @@
                 <w:sz w:val="20"/>
                 <w:szCs w:val="20"/>
               </w:rPr>
-              <w:t xml:space="preserve">Profile page</w:t>
+              <w:t xml:space="preserve">Home banner, cards, logo and Identify button</w:t>
             </w:r>
           </w:p>
         </w:tc>
@@ -7229,7 +7217,7 @@
                 <w:sz w:val="20"/>
                 <w:szCs w:val="20"/>
               </w:rPr>
-              <w:t xml:space="preserve">CSS animations</w:t>
+              <w:t xml:space="preserve">Expandable care tips and quiz answers</w:t>
             </w:r>
           </w:p>
         </w:tc>
@@ -7255,7 +7243,7 @@
                 <w:sz w:val="20"/>
                 <w:szCs w:val="20"/>
               </w:rPr>
-              <w:t xml:space="preserve">Home banner, cards, logo and Identify button</w:t>
+              <w:t xml:space="preserve">Identify and Explore pages</w:t>
             </w:r>
           </w:p>
         </w:tc>
@@ -7313,7 +7301,7 @@
                 <w:sz w:val="20"/>
                 <w:szCs w:val="20"/>
               </w:rPr>
-              <w:t xml:space="preserve">Expandable care tips and quiz answers</w:t>
+              <w:t xml:space="preserve">Live form feedback</w:t>
             </w:r>
           </w:p>
         </w:tc>
@@ -7339,7 +7327,7 @@
                 <w:sz w:val="20"/>
                 <w:szCs w:val="20"/>
               </w:rPr>
-              <w:t xml:space="preserve">Identify and Explore pages</w:t>
+              <w:t xml:space="preserve">Contribute and Enquiry forms</w:t>
             </w:r>
           </w:p>
         </w:tc>
@@ -7397,7 +7385,7 @@
                 <w:sz w:val="20"/>
                 <w:szCs w:val="20"/>
               </w:rPr>
-              <w:t xml:space="preserve">Live form feedback</w:t>
+              <w:t xml:space="preserve">Site-map footer</w:t>
             </w:r>
           </w:p>
         </w:tc>
@@ -7423,7 +7411,7 @@
                 <w:sz w:val="20"/>
                 <w:szCs w:val="20"/>
               </w:rPr>
-              <w:t xml:space="preserve">Contribute and Enquiry forms</w:t>
+              <w:t xml:space="preserve">Every page</w:t>
             </w:r>
           </w:p>
         </w:tc>
@@ -7481,7 +7469,7 @@
                 <w:sz w:val="20"/>
                 <w:szCs w:val="20"/>
               </w:rPr>
-              <w:t xml:space="preserve">Site-map footer</w:t>
+              <w:t xml:space="preserve">Site search with suggestions</w:t>
             </w:r>
           </w:p>
         </w:tc>
@@ -7507,7 +7495,7 @@
                 <w:sz w:val="20"/>
                 <w:szCs w:val="20"/>
               </w:rPr>
-              <w:t xml:space="preserve">Every page</w:t>
+              <w:t xml:space="preserve">Header on every page</w:t>
             </w:r>
           </w:p>
         </w:tc>
@@ -7565,7 +7553,7 @@
                 <w:sz w:val="20"/>
                 <w:szCs w:val="20"/>
               </w:rPr>
-              <w:t xml:space="preserve">Site search with suggestions</w:t>
+              <w:t xml:space="preserve">Phone-friendly pages</w:t>
             </w:r>
           </w:p>
         </w:tc>
@@ -7591,7 +7579,7 @@
                 <w:sz w:val="20"/>
                 <w:szCs w:val="20"/>
               </w:rPr>
-              <w:t xml:space="preserve">Header on every page</w:t>
+              <w:t xml:space="preserve">Every page on a phone</w:t>
             </w:r>
           </w:p>
         </w:tc>
@@ -7649,7 +7637,7 @@
                 <w:sz w:val="20"/>
                 <w:szCs w:val="20"/>
               </w:rPr>
-              <w:t xml:space="preserve">Phone-friendly pages</w:t>
+              <w:t xml:space="preserve">Link map diagram</w:t>
             </w:r>
           </w:p>
         </w:tc>
@@ -7675,7 +7663,7 @@
                 <w:sz w:val="20"/>
                 <w:szCs w:val="20"/>
               </w:rPr>
-              <w:t xml:space="preserve">Every page on a phone</w:t>
+              <w:t xml:space="preserve">Explore page</w:t>
             </w:r>
           </w:p>
         </w:tc>
@@ -7733,7 +7721,7 @@
                 <w:sz w:val="20"/>
                 <w:szCs w:val="20"/>
               </w:rPr>
-              <w:t xml:space="preserve">Link map diagram</w:t>
+              <w:t xml:space="preserve">Family comparison chart</w:t>
             </w:r>
           </w:p>
         </w:tc>
@@ -7792,90 +7780,6 @@
                 <w:szCs w:val="20"/>
               </w:rPr>
               <w:t xml:space="preserve">18</w:t>
-            </w:r>
-          </w:p>
-        </w:tc>
-        <w:tc>
-          <w:tcPr>
-            <w:tcW w:type="dxa" w:w="3300"/>
-            <w:tcBorders>
-              <w:top w:val="single" w:color="A3D9A5" w:sz="4"/>
-              <w:left w:val="single" w:color="A3D9A5" w:sz="4"/>
-              <w:bottom w:val="single" w:color="A3D9A5" w:sz="4"/>
-              <w:right w:val="single" w:color="A3D9A5" w:sz="4"/>
-            </w:tcBorders>
-            <w:tcMar>
-              <w:top w:type="dxa" w:w="60"/>
-              <w:left w:type="dxa" w:w="100"/>
-              <w:bottom w:type="dxa" w:w="60"/>
-              <w:right w:type="dxa" w:w="100"/>
-            </w:tcMar>
-          </w:tcPr>
-          <w:p>
-            <w:r>
-              <w:rPr>
-                <w:sz w:val="20"/>
-                <w:szCs w:val="20"/>
-              </w:rPr>
-              <w:t xml:space="preserve">Family comparison chart</w:t>
-            </w:r>
-          </w:p>
-        </w:tc>
-        <w:tc>
-          <w:tcPr>
-            <w:tcW w:type="dxa" w:w="5226"/>
-            <w:tcBorders>
-              <w:top w:val="single" w:color="A3D9A5" w:sz="4"/>
-              <w:left w:val="single" w:color="A3D9A5" w:sz="4"/>
-              <w:bottom w:val="single" w:color="A3D9A5" w:sz="4"/>
-              <w:right w:val="single" w:color="A3D9A5" w:sz="4"/>
-            </w:tcBorders>
-            <w:tcMar>
-              <w:top w:type="dxa" w:w="60"/>
-              <w:left w:type="dxa" w:w="100"/>
-              <w:bottom w:type="dxa" w:w="60"/>
-              <w:right w:type="dxa" w:w="100"/>
-            </w:tcMar>
-          </w:tcPr>
-          <w:p>
-            <w:r>
-              <w:rPr>
-                <w:sz w:val="20"/>
-                <w:szCs w:val="20"/>
-              </w:rPr>
-              <w:t xml:space="preserve">Explore page</w:t>
-            </w:r>
-          </w:p>
-        </w:tc>
-      </w:tr>
-      <w:tr>
-        <w:trPr>
-          <w:tblHeader w:val="false"/>
-        </w:trPr>
-        <w:tc>
-          <w:tcPr>
-            <w:tcW w:type="dxa" w:w="500"/>
-            <w:tcBorders>
-              <w:top w:val="single" w:color="A3D9A5" w:sz="4"/>
-              <w:left w:val="single" w:color="A3D9A5" w:sz="4"/>
-              <w:bottom w:val="single" w:color="A3D9A5" w:sz="4"/>
-              <w:right w:val="single" w:color="A3D9A5" w:sz="4"/>
-            </w:tcBorders>
-            <w:shd w:fill="D8F7E3" w:color="auto" w:val="clear"/>
-            <w:tcMar>
-              <w:top w:type="dxa" w:w="60"/>
-              <w:left w:type="dxa" w:w="100"/>
-              <w:bottom w:type="dxa" w:w="60"/>
-              <w:right w:type="dxa" w:w="100"/>
-            </w:tcMar>
-          </w:tcPr>
-          <w:p>
-            <w:r>
-              <w:rPr>
-                <w:sz w:val="20"/>
-                <w:szCs w:val="20"/>
-              </w:rPr>
-              <w:t xml:space="preserve">19</w:t>
             </w:r>
           </w:p>
         </w:tc>

</xml_diff>

<commit_message>
Use compact comment style in HTML and CSS
Co-Authored-By: Claude Opus 5.5 <noreply@anthropic.com>
Claude-Session: https://claude.ai/code/session_01PWSrX5UNJvmWZUCmWACvkF
</commit_message>
<xml_diff>
--- a/PlanetMatrix-Project-Report.docx
+++ b/PlanetMatrix-Project-Report.docx
@@ -2265,7 +2265,19 @@
         <w:t xml:space="preserve">Meta data and comments.</w:t>
       </w:r>
       <w:r>
-        <w:t xml:space="preserve"> Every page has a title, a character set, a viewport setting for phones, a description, keywords and an author, plus a header comment at the top with my name, student ID and the file’s purpose. Inside the page, each part has its own short, centred comment, such as “Search box with plant suggestions”, and blank lines separate the main blocks so the code is easy to read.</w:t>
+        <w:t xml:space="preserve"> Every page has a title, a character set, a viewport setting for phones, a description, keywords and an author, plus a header comment at the top with my name, student ID and the file’s purpose. Inside the page, each part has its own short comment in plain words, such as </w:t>
+      </w:r>
+      <w:r>
+        <w:rPr>
+          <w:rFonts w:ascii="Consolas" w:cs="Consolas" w:eastAsia="Consolas" w:hAnsi="Consolas"/>
+          <w:color w:val="1F6E56"/>
+          <w:sz w:val="20"/>
+          <w:szCs w:val="20"/>
+        </w:rPr>
+        <w:t xml:space="preserve">&lt;!--Search box with plant suggestions--&gt;</w:t>
+      </w:r>
+      <w:r>
+        <w:t xml:space="preserve">, and blank lines separate the main blocks so the code is easy to read.</w:t>
       </w:r>
     </w:p>
     <w:p>
@@ -3196,7 +3208,7 @@
         <w:t xml:space="preserve">styles/style.css</w:t>
       </w:r>
       <w:r>
-        <w:t xml:space="preserve">, which holds around 360 rules across 2,340 lines. It starts with a comment block explaining the file and the colour scheme, and every group of rules has a short, centred comment in plain words, such as </w:t>
+        <w:t xml:space="preserve">, which holds around 360 rules across 2,340 lines. It starts with a comment block explaining the file and the colour scheme, and every group of rules has a short comment in plain words, such as </w:t>
       </w:r>
       <w:r>
         <w:rPr>
@@ -3205,7 +3217,7 @@
           <w:sz w:val="20"/>
           <w:szCs w:val="20"/>
         </w:rPr>
-        <w:t xml:space="preserve">/* Stays at the top as you scroll */</w:t>
+        <w:t xml:space="preserve">/*Stays at the top as you scroll*/</w:t>
       </w:r>
       <w:r>
         <w:t xml:space="preserve"> or </w:t>
@@ -3217,7 +3229,7 @@
           <w:sz w:val="20"/>
           <w:szCs w:val="20"/>
         </w:rPr>
-        <w:t xml:space="preserve">/* Phones (700px wide and narrower) */</w:t>
+        <w:t xml:space="preserve">/*Phones (700px wide and narrower)*/</w:t>
       </w:r>
       <w:r>
         <w:t xml:space="preserve">. Blank lines separate the rules, so it’s easy to find your way around.</w:t>

</xml_diff>

<commit_message>
Follow the brief: sources after material, separate mobile.css, mailto in profile footer, Google Fonts link
Co-Authored-By: Claude Opus 5.5 <noreply@anthropic.com>
Claude-Session: https://claude.ai/code/session_01PWSrX5UNJvmWZUCmWACvkF
</commit_message>
<xml_diff>
--- a/PlanetMatrix-Project-Report.docx
+++ b/PlanetMatrix-Project-Report.docx
@@ -1681,7 +1681,7 @@
         <w:spacing w:after="140" w:line="300"/>
       </w:pPr>
       <w:r>
-        <w:t xml:space="preserve">The Families, Genera and Species pages follow the same pattern, which makes them easy to read. Each plant has its own boxed profile with a common name, a description in my own words, a list of quick facts such as origin and classification, a few tips on how to recognise it and a photo gallery. The pages are linked in both directions, so from a species you can jump up to its genus or family and back down again. Following the PlantsData document, I chose two families, two genera for each family and two species for each genus.</w:t>
+        <w:t xml:space="preserve">The Families, Genera and Species pages follow the same pattern, which makes them easy to read. Each plant has its own boxed profile with a common name, a description in my own words, a link to its source, a list of quick facts such as origin and classification, a few tips on how to recognise it and a photo gallery. The pages are linked in both directions, so from a species you can jump up to its genus or family and back down again. Following the PlantsData document, I chose two families, two genera for each family and two species for each genus.</w:t>
       </w:r>
     </w:p>
     <w:p>
@@ -3099,7 +3099,7 @@
         <w:t xml:space="preserve">Source Sans 3</w:t>
       </w:r>
       <w:r>
-        <w:t xml:space="preserve"> keeps the main text clean and easy to read. The fonts are saved inside the website, so they still load without an internet connection.</w:t>
+        <w:t xml:space="preserve"> keeps the main text clean and easy to read. They are linked from Google Fonts at the top of the stylesheet, and each one has a safe backup font.</w:t>
       </w:r>
     </w:p>
     <w:p>
@@ -3196,7 +3196,7 @@
         <w:spacing w:after="140" w:line="300"/>
       </w:pPr>
       <w:r>
-        <w:t xml:space="preserve">All the styling is in one file, </w:t>
+        <w:t xml:space="preserve">The styling is split into two files, as the brief asks. </w:t>
       </w:r>
       <w:r>
         <w:rPr>
@@ -3208,7 +3208,43 @@
         <w:t xml:space="preserve">styles/style.css</w:t>
       </w:r>
       <w:r>
-        <w:t xml:space="preserve">, which holds around 360 rules across 2,340 lines. It starts with a comment block explaining the file and the colour scheme, and every group of rules has a short comment in plain words, such as </w:t>
+        <w:t xml:space="preserve"> holds the desktop design, with around 320 rules, and </w:t>
+      </w:r>
+      <w:r>
+        <w:rPr>
+          <w:rFonts w:ascii="Consolas" w:cs="Consolas" w:eastAsia="Consolas" w:hAnsi="Consolas"/>
+          <w:color w:val="1F6E56"/>
+          <w:sz w:val="20"/>
+          <w:szCs w:val="20"/>
+        </w:rPr>
+        <w:t xml:space="preserve">styles/mobile.css</w:t>
+      </w:r>
+      <w:r>
+        <w:t xml:space="preserve"> holds the phone design, linked with </w:t>
+      </w:r>
+      <w:r>
+        <w:rPr>
+          <w:rFonts w:ascii="Consolas" w:cs="Consolas" w:eastAsia="Consolas" w:hAnsi="Consolas"/>
+          <w:color w:val="1F6E56"/>
+          <w:sz w:val="20"/>
+          <w:szCs w:val="20"/>
+        </w:rPr>
+        <w:t xml:space="preserve">media="screen and (max-width: 700px)"</w:t>
+      </w:r>
+      <w:r>
+        <w:t xml:space="preserve"> so it only switches on for small screens. Each file starts with a comment block explaining what it is for (</w:t>
+      </w:r>
+      <w:r>
+        <w:rPr>
+          <w:rFonts w:ascii="Consolas" w:cs="Consolas" w:eastAsia="Consolas" w:hAnsi="Consolas"/>
+          <w:color w:val="1F6E56"/>
+          <w:sz w:val="20"/>
+          <w:szCs w:val="20"/>
+        </w:rPr>
+        <w:t xml:space="preserve">style.css</w:t>
+      </w:r>
+      <w:r>
+        <w:t xml:space="preserve"> also lists the colour scheme), and every group of rules has a short comment in plain words, such as </w:t>
       </w:r>
       <w:r>
         <w:rPr>
@@ -4493,7 +4529,19 @@
         <w:t xml:space="preserve">Phones.</w:t>
       </w:r>
       <w:r>
-        <w:t xml:space="preserve"> A media query for screens 700px and narrower stacks the layout into one column, moves the search box below the logo and makes buttons easier to tap.</w:t>
+        <w:t xml:space="preserve"> The separate </w:t>
+      </w:r>
+      <w:r>
+        <w:rPr>
+          <w:rFonts w:ascii="Consolas" w:cs="Consolas" w:eastAsia="Consolas" w:hAnsi="Consolas"/>
+          <w:color w:val="1F6E56"/>
+          <w:sz w:val="20"/>
+          <w:szCs w:val="20"/>
+        </w:rPr>
+        <w:t xml:space="preserve">mobile.css</w:t>
+      </w:r>
+      <w:r>
+        <w:t xml:space="preserve"> file, used on screens 700px and narrower, stacks the layout into one column, moves the search box below the logo and makes buttons easier to tap.</w:t>
       </w:r>
     </w:p>
     <w:p>
@@ -4865,7 +4913,7 @@
           <wp:inline distT="0" distB="0" distL="0" distR="0">
             <wp:extent cx="5715000" cy="4019550"/>
             <wp:effectExtent t="0" r="0" b="0" l="0"/>
-            <wp:docPr id="1" name="species.png" descr="A species profile with its description, quick facts and recognition tips." title="A species profile with its description, quick facts and recognition tips."/>
+            <wp:docPr id="1" name="species.png" descr="A species profile with its description, source, quick facts and recognition tips." title="A species profile with its description, source, quick facts and recognition tips."/>
             <wp:cNvGraphicFramePr>
               <a:graphicFrameLocks xmlns:a="http://schemas.openxmlformats.org/drawingml/2006/main" noChangeAspect="1"/>
             </wp:cNvGraphicFramePr>
@@ -4924,7 +4972,7 @@
           <w:sz w:val="19"/>
           <w:szCs w:val="19"/>
         </w:rPr>
-        <w:t xml:space="preserve">A species profile with its description, quick facts and recognition tips.</w:t>
+        <w:t xml:space="preserve">A species profile with its description, source, quick facts and recognition tips.</w:t>
       </w:r>
     </w:p>
     <w:p>
@@ -5312,7 +5360,7 @@
         <w:t xml:space="preserve">Honest about sources.</w:t>
       </w:r>
       <w:r>
-        <w:t xml:space="preserve"> Every plant description, photo, font and picture is credited in one place, the Acknowledgements page, which lists more than 150 credits with links back to each source.</w:t>
+        <w:t xml:space="preserve"> Every description has a source link right after it, every gallery is credited, and the Acknowledgements page lists more than 150 credits.</w:t>
       </w:r>
     </w:p>
     <w:p>

</xml_diff>

<commit_message>
Explain key features and every enhancement in detail in the report
Co-Authored-By: Claude Opus 5.5 <noreply@anthropic.com>
Claude-Session: https://claude.ai/code/session_01PWSrX5UNJvmWZUCmWACvkF
</commit_message>
<xml_diff>
--- a/PlanetMatrix-Project-Report.docx
+++ b/PlanetMatrix-Project-Report.docx
@@ -2009,6 +2009,14 @@
     </w:p>
     <w:p>
       <w:pPr>
+        <w:spacing w:after="140" w:line="300"/>
+      </w:pPr>
+      <w:r>
+        <w:t xml:space="preserve">Before looking at the enhancements one by one, here are the qualities that run through the whole website and make it more than a set of pages.</w:t>
+      </w:r>
+    </w:p>
+    <w:p>
+      <w:pPr>
         <w:pStyle w:val="ListParagraph"/>
         <w:numPr>
           <w:ilvl w:val="0"/>
@@ -2024,7 +2032,7 @@
         <w:t xml:space="preserve">A connected plant encyclopedia.</w:t>
       </w:r>
       <w:r>
-        <w:t xml:space="preserve"> All fourteen plants link up and down between families, genera and species, and the link map shows the whole picture at a glance.</w:t>
+        <w:t xml:space="preserve"> All fourteen plants, two families, four genera and eight species, are linked to each other. From any species you can jump straight up to its genus or family, and from a family you can go back down to every plant in it. The link map on the Explorer page shows all of these connections in one tree, so visitors always see where a plant fits in the bigger picture.</w:t>
       </w:r>
     </w:p>
     <w:p>
@@ -2044,7 +2052,7 @@
         <w:t xml:space="preserve">Learning by doing.</w:t>
       </w:r>
       <w:r>
-        <w:t xml:space="preserve"> The comparison chart, the quiz and the “How to Tell the Two Families Apart” steps turn reading into something more hands-on.</w:t>
+        <w:t xml:space="preserve"> Reading about plants can feel dry, so the Explorer page gives visitors things to do. The comparison chart lets you compare the two families row by row, the “How to Tell the Two Families Apart” steps walk you through what to look for in the forest, and a six-question quiz lets you test yourself, with each answer hidden until you click to reveal it.</w:t>
       </w:r>
     </w:p>
     <w:p>
@@ -2064,7 +2072,7 @@
         <w:t xml:space="preserve">Friendly forms.</w:t>
       </w:r>
       <w:r>
-        <w:t xml:space="preserve"> Fields turn red or green as you type, the section you’re working on lights up, and phones bring up the right keyboard or a date picker.</w:t>
+        <w:t xml:space="preserve"> The contribution and enquiry forms help people get things right the first time. Every field turns red while the entry still needs fixing and green once it is correct, the section you are filling in lights up, and nothing can be sent while a required field is empty. On a phone, the email, phone and date fields bring up the right keyboard or a calendar.</w:t>
       </w:r>
     </w:p>
     <w:p>
@@ -2084,7 +2092,7 @@
         <w:t xml:space="preserve">Honest about sources.</w:t>
       </w:r>
       <w:r>
-        <w:t xml:space="preserve"> Every description has a source link right after it, every gallery is credited, and the Acknowledgements page lists more than 150 credits.</w:t>
+        <w:t xml:space="preserve"> Every plant description has a source link right after it, every photo gallery says where its photos come from, and the Acknowledgements page lists more than 150 credits in five groups: photos, information, icons, buttons and enhancements. Nothing on the site is used without saying where it came from.</w:t>
       </w:r>
     </w:p>
     <w:p>
@@ -2104,7 +2112,27 @@
         <w:t xml:space="preserve">Comfortable for everyone.</w:t>
       </w:r>
       <w:r>
-        <w:t xml:space="preserve"> The text is written in clear, friendly English, links are bold and easy to spot, and the site works on phones, with the keyboard and with reduced motion.</w:t>
+        <w:t xml:space="preserve"> The text is written in clear, friendly English. Links are bold with a thick underline, so they are easy to spot. Every page works on a phone, every feature can be reached with the keyboard as well as the mouse, and anyone who has turned on “reduce motion” on their device sees the site without animations.</w:t>
+      </w:r>
+    </w:p>
+    <w:p>
+      <w:pPr>
+        <w:pStyle w:val="ListParagraph"/>
+        <w:numPr>
+          <w:ilvl w:val="0"/>
+          <w:numId w:val="2"/>
+        </w:numPr>
+        <w:spacing w:after="70" w:line="290"/>
+      </w:pPr>
+      <w:r>
+        <w:rPr>
+          <w:b/>
+          <w:bCs/>
+        </w:rPr>
+        <w:t xml:space="preserve">No JavaScript at all.</w:t>
+      </w:r>
+      <w:r>
+        <w:t xml:space="preserve"> Everything on the website, including the sliding menu, the photo viewer, the flip cards and the star rating, is built with HTML and CSS alone, as the brief requires.</w:t>
       </w:r>
     </w:p>
     <w:p>
@@ -2120,7 +2148,7 @@
         <w:spacing w:after="140" w:line="300"/>
       </w:pPr>
       <w:r>
-        <w:t xml:space="preserve">The brief says up to four enhancements will be marked, so these are the four I’ve put forward. All of them work without any JavaScript.</w:t>
+        <w:t xml:space="preserve">The brief says up to four enhancements will be marked, so these are the four I have put forward. For each one, I explain what it does, how it works, where to find it and why it helps visitors.</w:t>
       </w:r>
     </w:p>
     <w:p>
@@ -2133,10 +2161,578 @@
     </w:p>
     <w:p>
       <w:pPr>
+        <w:pStyle w:val="ListParagraph"/>
+        <w:numPr>
+          <w:ilvl w:val="0"/>
+          <w:numId w:val="2"/>
+        </w:numPr>
+        <w:spacing w:after="70" w:line="290"/>
+      </w:pPr>
+      <w:r>
+        <w:rPr>
+          <w:b/>
+          <w:bCs/>
+        </w:rPr>
+        <w:t xml:space="preserve">What it does.</w:t>
+      </w:r>
+      <w:r>
+        <w:t xml:space="preserve"> Every page stretches or shrinks to fit the screen, from a wide desktop monitor down to a small phone. On top of that, a ☰ button to the left of the logo opens a side menu that slides in from the left and lists all twelve pages, including the three Explorer levels, the Enhancements page and the Acknowledgements page.</w:t>
+      </w:r>
+    </w:p>
+    <w:p>
+      <w:pPr>
+        <w:pStyle w:val="ListParagraph"/>
+        <w:numPr>
+          <w:ilvl w:val="0"/>
+          <w:numId w:val="2"/>
+        </w:numPr>
+        <w:spacing w:after="70" w:line="290"/>
+      </w:pPr>
+      <w:r>
+        <w:rPr>
+          <w:b/>
+          <w:bCs/>
+        </w:rPr>
+        <w:t xml:space="preserve">How it works.</w:t>
+      </w:r>
+      <w:r>
+        <w:t xml:space="preserve"> Widths are set in percentages and viewport units, and flexbox and CSS grid let rows of cards rearrange themselves as the window changes size. The side menu uses a hidden checkbox. The ☰ button is the checkbox’s </w:t>
+      </w:r>
+      <w:r>
+        <w:rPr>
+          <w:rFonts w:ascii="Consolas" w:cs="Consolas" w:eastAsia="Consolas" w:hAnsi="Consolas"/>
+          <w:color w:val="1F6E56"/>
+          <w:sz w:val="20"/>
+          <w:szCs w:val="20"/>
+        </w:rPr>
+        <w:t xml:space="preserve">&lt;label&gt;</w:t>
+      </w:r>
+      <w:r>
+        <w:t xml:space="preserve">, so clicking it ticks the box. The menu normally sits just off the left edge of the screen with </w:t>
+      </w:r>
+      <w:r>
+        <w:rPr>
+          <w:rFonts w:ascii="Consolas" w:cs="Consolas" w:eastAsia="Consolas" w:hAnsi="Consolas"/>
+          <w:color w:val="1F6E56"/>
+          <w:sz w:val="20"/>
+          <w:szCs w:val="20"/>
+        </w:rPr>
+        <w:t xml:space="preserve">transform: translateX(-105%)</w:t>
+      </w:r>
+      <w:r>
+        <w:t xml:space="preserve">. When the box is ticked, the rule </w:t>
+      </w:r>
+      <w:r>
+        <w:rPr>
+          <w:rFonts w:ascii="Consolas" w:cs="Consolas" w:eastAsia="Consolas" w:hAnsi="Consolas"/>
+          <w:color w:val="1F6E56"/>
+          <w:sz w:val="20"/>
+          <w:szCs w:val="20"/>
+        </w:rPr>
+        <w:t xml:space="preserve">.menu-toggle:checked ~ .side-menu</w:t>
+      </w:r>
+      <w:r>
+        <w:t xml:space="preserve"> moves it back to </w:t>
+      </w:r>
+      <w:r>
+        <w:rPr>
+          <w:rFonts w:ascii="Consolas" w:cs="Consolas" w:eastAsia="Consolas" w:hAnsi="Consolas"/>
+          <w:color w:val="1F6E56"/>
+          <w:sz w:val="20"/>
+          <w:szCs w:val="20"/>
+        </w:rPr>
+        <w:t xml:space="preserve">translateX(0)</w:t>
+      </w:r>
+      <w:r>
+        <w:t xml:space="preserve">, and a </w:t>
+      </w:r>
+      <w:r>
+        <w:rPr>
+          <w:rFonts w:ascii="Consolas" w:cs="Consolas" w:eastAsia="Consolas" w:hAnsi="Consolas"/>
+          <w:color w:val="1F6E56"/>
+          <w:sz w:val="20"/>
+          <w:szCs w:val="20"/>
+        </w:rPr>
+        <w:t xml:space="preserve">transition</w:t>
+      </w:r>
+      <w:r>
+        <w:t xml:space="preserve"> of 0.35 seconds makes it glide in. A second label, “× Close”, unticks the box and slides the menu away again.</w:t>
+      </w:r>
+    </w:p>
+    <w:p>
+      <w:pPr>
+        <w:pStyle w:val="ListParagraph"/>
+        <w:numPr>
+          <w:ilvl w:val="0"/>
+          <w:numId w:val="2"/>
+        </w:numPr>
+        <w:spacing w:after="70" w:line="290"/>
+      </w:pPr>
+      <w:r>
+        <w:rPr>
+          <w:b/>
+          <w:bCs/>
+        </w:rPr>
+        <w:t xml:space="preserve">Where to see it.</w:t>
+      </w:r>
+      <w:r>
+        <w:t xml:space="preserve"> The ☰ button is in the header of every page. To see the fluid layout, open any page and make the browser window narrower.</w:t>
+      </w:r>
+    </w:p>
+    <w:p>
+      <w:pPr>
+        <w:pStyle w:val="ListParagraph"/>
+        <w:numPr>
+          <w:ilvl w:val="0"/>
+          <w:numId w:val="2"/>
+        </w:numPr>
+        <w:spacing w:after="70" w:line="290"/>
+      </w:pPr>
+      <w:r>
+        <w:rPr>
+          <w:b/>
+          <w:bCs/>
+        </w:rPr>
+        <w:t xml:space="preserve">Why it helps.</w:t>
+      </w:r>
+      <w:r>
+        <w:t xml:space="preserve"> The main menu bar only has room for the six most-used pages. The side menu makes sure every page is always one click away, without crowding the menu bar.</w:t>
+      </w:r>
+    </w:p>
+    <w:p>
+      <w:pPr>
+        <w:pStyle w:val="Heading3"/>
+      </w:pPr>
+      <w:r>
+        <w:t xml:space="preserve">Enhancement 2: Fixed navigation bar</w:t>
+      </w:r>
+    </w:p>
+    <w:p>
+      <w:pPr>
+        <w:pStyle w:val="ListParagraph"/>
+        <w:numPr>
+          <w:ilvl w:val="0"/>
+          <w:numId w:val="2"/>
+        </w:numPr>
+        <w:spacing w:after="70" w:line="290"/>
+      </w:pPr>
+      <w:r>
+        <w:rPr>
+          <w:b/>
+          <w:bCs/>
+        </w:rPr>
+        <w:t xml:space="preserve">What it does.</w:t>
+      </w:r>
+      <w:r>
+        <w:t xml:space="preserve"> The menu bar stays at the top of the screen as you scroll down, so you never have to scroll back up to move to another page.</w:t>
+      </w:r>
+    </w:p>
+    <w:p>
+      <w:pPr>
+        <w:pStyle w:val="ListParagraph"/>
+        <w:numPr>
+          <w:ilvl w:val="0"/>
+          <w:numId w:val="2"/>
+        </w:numPr>
+        <w:spacing w:after="70" w:line="290"/>
+      </w:pPr>
+      <w:r>
+        <w:rPr>
+          <w:b/>
+          <w:bCs/>
+        </w:rPr>
+        <w:t xml:space="preserve">How it works.</w:t>
+      </w:r>
+      <w:r>
+        <w:t xml:space="preserve"> The menu bar uses </w:t>
+      </w:r>
+      <w:r>
+        <w:rPr>
+          <w:rFonts w:ascii="Consolas" w:cs="Consolas" w:eastAsia="Consolas" w:hAnsi="Consolas"/>
+          <w:color w:val="1F6E56"/>
+          <w:sz w:val="20"/>
+          <w:szCs w:val="20"/>
+        </w:rPr>
+        <w:t xml:space="preserve">position: sticky</w:t>
+      </w:r>
+      <w:r>
+        <w:t xml:space="preserve"> with </w:t>
+      </w:r>
+      <w:r>
+        <w:rPr>
+          <w:rFonts w:ascii="Consolas" w:cs="Consolas" w:eastAsia="Consolas" w:hAnsi="Consolas"/>
+          <w:color w:val="1F6E56"/>
+          <w:sz w:val="20"/>
+          <w:szCs w:val="20"/>
+        </w:rPr>
+        <w:t xml:space="preserve">top: 0</w:t>
+      </w:r>
+      <w:r>
+        <w:t xml:space="preserve">. It scrolls normally with the page until it reaches the top of the window, then stays there. A </w:t>
+      </w:r>
+      <w:r>
+        <w:rPr>
+          <w:rFonts w:ascii="Consolas" w:cs="Consolas" w:eastAsia="Consolas" w:hAnsi="Consolas"/>
+          <w:color w:val="1F6E56"/>
+          <w:sz w:val="20"/>
+          <w:szCs w:val="20"/>
+        </w:rPr>
+        <w:t xml:space="preserve">z-index</w:t>
+      </w:r>
+      <w:r>
+        <w:t xml:space="preserve"> keeps it above the rest of the content. I also added </w:t>
+      </w:r>
+      <w:r>
+        <w:rPr>
+          <w:rFonts w:ascii="Consolas" w:cs="Consolas" w:eastAsia="Consolas" w:hAnsi="Consolas"/>
+          <w:color w:val="1F6E56"/>
+          <w:sz w:val="20"/>
+          <w:szCs w:val="20"/>
+        </w:rPr>
+        <w:t xml:space="preserve">scroll-padding-top</w:t>
+      </w:r>
+      <w:r>
+        <w:t xml:space="preserve"> to the page, so that when a link jumps to a section further down, the heading lands just below the menu bar instead of hiding behind it.</w:t>
+      </w:r>
+    </w:p>
+    <w:p>
+      <w:pPr>
+        <w:pStyle w:val="ListParagraph"/>
+        <w:numPr>
+          <w:ilvl w:val="0"/>
+          <w:numId w:val="2"/>
+        </w:numPr>
+        <w:spacing w:after="70" w:line="290"/>
+      </w:pPr>
+      <w:r>
+        <w:rPr>
+          <w:b/>
+          <w:bCs/>
+        </w:rPr>
+        <w:t xml:space="preserve">Where to see it.</w:t>
+      </w:r>
+      <w:r>
+        <w:t xml:space="preserve"> It works on every page, but it is most useful on the long Species page, which has eight plant profiles.</w:t>
+      </w:r>
+    </w:p>
+    <w:p>
+      <w:pPr>
+        <w:pStyle w:val="ListParagraph"/>
+        <w:numPr>
+          <w:ilvl w:val="0"/>
+          <w:numId w:val="2"/>
+        </w:numPr>
+        <w:spacing w:after="70" w:line="290"/>
+      </w:pPr>
+      <w:r>
+        <w:rPr>
+          <w:b/>
+          <w:bCs/>
+        </w:rPr>
+        <w:t xml:space="preserve">Why it helps.</w:t>
+      </w:r>
+      <w:r>
+        <w:t xml:space="preserve"> On long pages, visitors can switch pages or jump around at any moment, which makes the whole site quicker and easier to use.</w:t>
+      </w:r>
+    </w:p>
+    <w:p>
+      <w:pPr>
+        <w:pStyle w:val="Heading3"/>
+      </w:pPr>
+      <w:r>
+        <w:t xml:space="preserve">Enhancement 3: Photo gallery with a lightbox</w:t>
+      </w:r>
+    </w:p>
+    <w:p>
+      <w:pPr>
+        <w:pStyle w:val="ListParagraph"/>
+        <w:numPr>
+          <w:ilvl w:val="0"/>
+          <w:numId w:val="2"/>
+        </w:numPr>
+        <w:spacing w:after="70" w:line="290"/>
+      </w:pPr>
+      <w:r>
+        <w:rPr>
+          <w:b/>
+          <w:bCs/>
+        </w:rPr>
+        <w:t xml:space="preserve">What it does.</w:t>
+      </w:r>
+      <w:r>
+        <w:t xml:space="preserve"> Every family, genus and species has its own photo gallery, and the Explorer page has one too. Clicking a photo opens it full-screen over a dark background, with its caption and a Close button.</w:t>
+      </w:r>
+    </w:p>
+    <w:p>
+      <w:pPr>
+        <w:pStyle w:val="ListParagraph"/>
+        <w:numPr>
+          <w:ilvl w:val="0"/>
+          <w:numId w:val="2"/>
+        </w:numPr>
+        <w:spacing w:after="70" w:line="290"/>
+      </w:pPr>
+      <w:r>
+        <w:rPr>
+          <w:b/>
+          <w:bCs/>
+        </w:rPr>
+        <w:t xml:space="preserve">How it works.</w:t>
+      </w:r>
+      <w:r>
+        <w:t xml:space="preserve"> Each full-size viewer is a hidden </w:t>
+      </w:r>
+      <w:r>
+        <w:rPr>
+          <w:rFonts w:ascii="Consolas" w:cs="Consolas" w:eastAsia="Consolas" w:hAnsi="Consolas"/>
+          <w:color w:val="1F6E56"/>
+          <w:sz w:val="20"/>
+          <w:szCs w:val="20"/>
+        </w:rPr>
+        <w:t xml:space="preserve">&lt;div class="lightbox"&gt;</w:t>
+      </w:r>
+      <w:r>
+        <w:t xml:space="preserve"> with its own id further down the page. Each thumbnail is a link to that id, for example </w:t>
+      </w:r>
+      <w:r>
+        <w:rPr>
+          <w:rFonts w:ascii="Consolas" w:cs="Consolas" w:eastAsia="Consolas" w:hAnsi="Consolas"/>
+          <w:color w:val="1F6E56"/>
+          <w:sz w:val="20"/>
+          <w:szCs w:val="20"/>
+        </w:rPr>
+        <w:t xml:space="preserve">#view-d-alatus-1</w:t>
+      </w:r>
+      <w:r>
+        <w:t xml:space="preserve">. When the address bar ends with that id, the </w:t>
+      </w:r>
+      <w:r>
+        <w:rPr>
+          <w:rFonts w:ascii="Consolas" w:cs="Consolas" w:eastAsia="Consolas" w:hAnsi="Consolas"/>
+          <w:color w:val="1F6E56"/>
+          <w:sz w:val="20"/>
+          <w:szCs w:val="20"/>
+        </w:rPr>
+        <w:t xml:space="preserve">:target</w:t>
+      </w:r>
+      <w:r>
+        <w:t xml:space="preserve"> selector switches the viewer on with </w:t>
+      </w:r>
+      <w:r>
+        <w:rPr>
+          <w:rFonts w:ascii="Consolas" w:cs="Consolas" w:eastAsia="Consolas" w:hAnsi="Consolas"/>
+          <w:color w:val="1F6E56"/>
+          <w:sz w:val="20"/>
+          <w:szCs w:val="20"/>
+        </w:rPr>
+        <w:t xml:space="preserve">display: block</w:t>
+      </w:r>
+      <w:r>
+        <w:t xml:space="preserve">. It uses </w:t>
+      </w:r>
+      <w:r>
+        <w:rPr>
+          <w:rFonts w:ascii="Consolas" w:cs="Consolas" w:eastAsia="Consolas" w:hAnsi="Consolas"/>
+          <w:color w:val="1F6E56"/>
+          <w:sz w:val="20"/>
+          <w:szCs w:val="20"/>
+        </w:rPr>
+        <w:t xml:space="preserve">position: fixed</w:t>
+      </w:r>
+      <w:r>
+        <w:t xml:space="preserve"> to cover the whole window and a dark, see-through background so the photo stands out. The Close link points back to the plant’s own section, so the viewer is no longer the target and hides again.</w:t>
+      </w:r>
+    </w:p>
+    <w:p>
+      <w:pPr>
+        <w:pStyle w:val="ListParagraph"/>
+        <w:numPr>
+          <w:ilvl w:val="0"/>
+          <w:numId w:val="2"/>
+        </w:numPr>
+        <w:spacing w:after="70" w:line="290"/>
+      </w:pPr>
+      <w:r>
+        <w:rPr>
+          <w:b/>
+          <w:bCs/>
+        </w:rPr>
+        <w:t xml:space="preserve">Where to see it.</w:t>
+      </w:r>
+      <w:r>
+        <w:t xml:space="preserve"> In the galleries on the Explorer, Families, Genera and Species pages.</w:t>
+      </w:r>
+    </w:p>
+    <w:p>
+      <w:pPr>
+        <w:pStyle w:val="ListParagraph"/>
+        <w:numPr>
+          <w:ilvl w:val="0"/>
+          <w:numId w:val="2"/>
+        </w:numPr>
+        <w:spacing w:after="70" w:line="290"/>
+      </w:pPr>
+      <w:r>
+        <w:rPr>
+          <w:b/>
+          <w:bCs/>
+        </w:rPr>
+        <w:t xml:space="preserve">Why it helps.</w:t>
+      </w:r>
+      <w:r>
+        <w:t xml:space="preserve"> The small thumbnails keep the pages tidy, while anyone who wants a closer look at the leaves, bark or fruit can see each photo in full detail.</w:t>
+      </w:r>
+    </w:p>
+    <w:p>
+      <w:pPr>
+        <w:pStyle w:val="Heading3"/>
+      </w:pPr>
+      <w:r>
+        <w:t xml:space="preserve">Enhancement 4: Flip cards</w:t>
+      </w:r>
+    </w:p>
+    <w:p>
+      <w:pPr>
+        <w:pStyle w:val="ListParagraph"/>
+        <w:numPr>
+          <w:ilvl w:val="0"/>
+          <w:numId w:val="2"/>
+        </w:numPr>
+        <w:spacing w:after="70" w:line="290"/>
+      </w:pPr>
+      <w:r>
+        <w:rPr>
+          <w:b/>
+          <w:bCs/>
+        </w:rPr>
+        <w:t xml:space="preserve">What it does.</w:t>
+      </w:r>
+      <w:r>
+        <w:t xml:space="preserve"> Flip cards show a plant photo on the front. When you move the mouse over a card, or reach its link with the keyboard, it turns over in 3D to reveal a fun fact and a link to that plant.</w:t>
+      </w:r>
+    </w:p>
+    <w:p>
+      <w:pPr>
+        <w:pStyle w:val="ListParagraph"/>
+        <w:numPr>
+          <w:ilvl w:val="0"/>
+          <w:numId w:val="2"/>
+        </w:numPr>
+        <w:spacing w:after="70" w:line="290"/>
+      </w:pPr>
+      <w:r>
+        <w:rPr>
+          <w:b/>
+          <w:bCs/>
+        </w:rPr>
+        <w:t xml:space="preserve">How it works.</w:t>
+      </w:r>
+      <w:r>
+        <w:t xml:space="preserve"> Each card has a front and a back stacked on top of each other inside an inner box. The card container has </w:t>
+      </w:r>
+      <w:r>
+        <w:rPr>
+          <w:rFonts w:ascii="Consolas" w:cs="Consolas" w:eastAsia="Consolas" w:hAnsi="Consolas"/>
+          <w:color w:val="1F6E56"/>
+          <w:sz w:val="20"/>
+          <w:szCs w:val="20"/>
+        </w:rPr>
+        <w:t xml:space="preserve">perspective: 1000px</w:t>
+      </w:r>
+      <w:r>
+        <w:t xml:space="preserve">, which gives the turn a sense of depth. On hover or keyboard focus, the inner box rotates with </w:t>
+      </w:r>
+      <w:r>
+        <w:rPr>
+          <w:rFonts w:ascii="Consolas" w:cs="Consolas" w:eastAsia="Consolas" w:hAnsi="Consolas"/>
+          <w:color w:val="1F6E56"/>
+          <w:sz w:val="20"/>
+          <w:szCs w:val="20"/>
+        </w:rPr>
+        <w:t xml:space="preserve">transform: rotateY(180deg)</w:t>
+      </w:r>
+      <w:r>
+        <w:t xml:space="preserve"> and a smooth </w:t>
+      </w:r>
+      <w:r>
+        <w:rPr>
+          <w:rFonts w:ascii="Consolas" w:cs="Consolas" w:eastAsia="Consolas" w:hAnsi="Consolas"/>
+          <w:color w:val="1F6E56"/>
+          <w:sz w:val="20"/>
+          <w:szCs w:val="20"/>
+        </w:rPr>
+        <w:t xml:space="preserve">transition</w:t>
+      </w:r>
+      <w:r>
+        <w:t xml:space="preserve">. The back is already turned around by 180 degrees, and both sides use </w:t>
+      </w:r>
+      <w:r>
+        <w:rPr>
+          <w:rFonts w:ascii="Consolas" w:cs="Consolas" w:eastAsia="Consolas" w:hAnsi="Consolas"/>
+          <w:color w:val="1F6E56"/>
+          <w:sz w:val="20"/>
+          <w:szCs w:val="20"/>
+        </w:rPr>
+        <w:t xml:space="preserve">backface-visibility: hidden</w:t>
+      </w:r>
+      <w:r>
+        <w:t xml:space="preserve">, so you only ever see one side at a time.</w:t>
+      </w:r>
+    </w:p>
+    <w:p>
+      <w:pPr>
+        <w:pStyle w:val="ListParagraph"/>
+        <w:numPr>
+          <w:ilvl w:val="0"/>
+          <w:numId w:val="2"/>
+        </w:numPr>
+        <w:spacing w:after="70" w:line="290"/>
+      </w:pPr>
+      <w:r>
+        <w:rPr>
+          <w:b/>
+          <w:bCs/>
+        </w:rPr>
+        <w:t xml:space="preserve">Where to see it.</w:t>
+      </w:r>
+      <w:r>
+        <w:t xml:space="preserve"> In the “Meet the Plants” section on the Home page (four cards) and in the Species Flip Gallery on the Explorer page (eight cards, one for each species).</w:t>
+      </w:r>
+    </w:p>
+    <w:p>
+      <w:pPr>
+        <w:pStyle w:val="ListParagraph"/>
+        <w:numPr>
+          <w:ilvl w:val="0"/>
+          <w:numId w:val="2"/>
+        </w:numPr>
+        <w:spacing w:after="70" w:line="290"/>
+      </w:pPr>
+      <w:r>
+        <w:rPr>
+          <w:b/>
+          <w:bCs/>
+        </w:rPr>
+        <w:t xml:space="preserve">Why it helps.</w:t>
+      </w:r>
+      <w:r>
+        <w:t xml:space="preserve"> The cards make learning playful. Visitors are curious to see what is on the back, and each card leads straight to the full plant profile.</w:t>
+      </w:r>
+    </w:p>
+    <w:p>
+      <w:pPr>
+        <w:pStyle w:val="Heading2"/>
+      </w:pPr>
+      <w:r>
+        <w:t xml:space="preserve">4.3 Other enhancements</w:t>
+      </w:r>
+    </w:p>
+    <w:p>
+      <w:pPr>
         <w:spacing w:after="140" w:line="300"/>
       </w:pPr>
       <w:r>
-        <w:t xml:space="preserve">Every page stretches or shrinks to fit the screen. On top of that, the ☰ button to the left of the logo opens a side menu listing every page on the site. The trick is a hidden checkbox: the ☰ button is its label, so clicking it ticks the box. The side menu starts off-screen, and as soon as the box is ticked, a sibling selector slides it in.</w:t>
+        <w:t xml:space="preserve">Beyond the main four, the site has fourteen more enhancements. Each one is described below, and each is also explained on the Enhancements page with links to where it is used.</w:t>
       </w:r>
     </w:p>
     <w:p>
@@ -2144,7 +2740,7 @@
         <w:pStyle w:val="Heading3"/>
       </w:pPr>
       <w:r>
-        <w:t xml:space="preserve">Enhancement 2: Fixed navigation bar</w:t>
+        <w:t xml:space="preserve">5. Page rating</w:t>
       </w:r>
     </w:p>
     <w:p>
@@ -2152,31 +2748,31 @@
         <w:spacing w:after="140" w:line="300"/>
       </w:pPr>
       <w:r>
-        <w:t xml:space="preserve">The menu bar stays at the top of the screen as you scroll, which really helps on the long Species page. It uses </w:t>
-      </w:r>
-      <w:r>
-        <w:rPr>
-          <w:rFonts w:ascii="Consolas" w:cs="Consolas" w:eastAsia="Consolas" w:hAnsi="Consolas"/>
-          <w:color w:val="1F6E56"/>
-          <w:sz w:val="20"/>
-          <w:szCs w:val="20"/>
-        </w:rPr>
-        <w:t xml:space="preserve">position: sticky; top: 0;</w:t>
-      </w:r>
-      <w:r>
-        <w:t xml:space="preserve">, so the bar scrolls normally until it reaches the top and then stays put. I also added </w:t>
-      </w:r>
-      <w:r>
-        <w:rPr>
-          <w:rFonts w:ascii="Consolas" w:cs="Consolas" w:eastAsia="Consolas" w:hAnsi="Consolas"/>
-          <w:color w:val="1F6E56"/>
-          <w:sz w:val="20"/>
-          <w:szCs w:val="20"/>
-        </w:rPr>
-        <w:t xml:space="preserve">scroll-padding-top</w:t>
-      </w:r>
-      <w:r>
-        <w:t xml:space="preserve"> so that headings don’t hide under the bar when you jump to a section.</w:t>
+        <w:t xml:space="preserve">Visitors can rate the Explorer page from one to five stars. The stars are ordinary radio buttons, with the round buttons hidden and their labels drawn as stars. The stars are written in the code from 5 down to 1 and then flipped on screen with </w:t>
+      </w:r>
+      <w:r>
+        <w:rPr>
+          <w:rFonts w:ascii="Consolas" w:cs="Consolas" w:eastAsia="Consolas" w:hAnsi="Consolas"/>
+          <w:color w:val="1F6E56"/>
+          <w:sz w:val="20"/>
+          <w:szCs w:val="20"/>
+        </w:rPr>
+        <w:t xml:space="preserve">flex-direction: row-reverse</w:t>
+      </w:r>
+      <w:r>
+        <w:t xml:space="preserve">. That lets the sibling selector </w:t>
+      </w:r>
+      <w:r>
+        <w:rPr>
+          <w:rFonts w:ascii="Consolas" w:cs="Consolas" w:eastAsia="Consolas" w:hAnsi="Consolas"/>
+          <w:color w:val="1F6E56"/>
+          <w:sz w:val="20"/>
+          <w:szCs w:val="20"/>
+        </w:rPr>
+        <w:t xml:space="preserve">~</w:t>
+      </w:r>
+      <w:r>
+        <w:t xml:space="preserve"> light up every star up to the one you point at or choose, which would not be possible in the normal order. The rating is sent to the test server like any other form answer.</w:t>
       </w:r>
     </w:p>
     <w:p>
@@ -2184,7 +2780,7 @@
         <w:pStyle w:val="Heading3"/>
       </w:pPr>
       <w:r>
-        <w:t xml:space="preserve">Enhancement 3: Photo gallery with a lightbox</w:t>
+        <w:t xml:space="preserve">6. Picture hover effect</w:t>
       </w:r>
     </w:p>
     <w:p>
@@ -2192,19 +2788,31 @@
         <w:spacing w:after="140" w:line="300"/>
       </w:pPr>
       <w:r>
-        <w:t xml:space="preserve">Every plant has its own photo gallery. Clicking a photo opens it full-screen over a dark background, with its caption and a Close button. Each thumbnail links to the id of a hidden viewer further down the page. When the address ends with that id, the </w:t>
-      </w:r>
-      <w:r>
-        <w:rPr>
-          <w:rFonts w:ascii="Consolas" w:cs="Consolas" w:eastAsia="Consolas" w:hAnsi="Consolas"/>
-          <w:color w:val="1F6E56"/>
-          <w:sz w:val="20"/>
-          <w:szCs w:val="20"/>
-        </w:rPr>
-        <w:t xml:space="preserve">:target</w:t>
-      </w:r>
-      <w:r>
-        <w:t xml:space="preserve"> selector shows the viewer, and the Close link points back to the gallery so the viewer hides again.</w:t>
+        <w:t xml:space="preserve">Pictures respond when you point at them. The family tree picture and the main gallery photos grow slightly with </w:t>
+      </w:r>
+      <w:r>
+        <w:rPr>
+          <w:rFonts w:ascii="Consolas" w:cs="Consolas" w:eastAsia="Consolas" w:hAnsi="Consolas"/>
+          <w:color w:val="1F6E56"/>
+          <w:sz w:val="20"/>
+          <w:szCs w:val="20"/>
+        </w:rPr>
+        <w:t xml:space="preserve">transform: scale()</w:t>
+      </w:r>
+      <w:r>
+        <w:t xml:space="preserve"> and gain a deeper shadow, and the thumbnails zoom in gently. A </w:t>
+      </w:r>
+      <w:r>
+        <w:rPr>
+          <w:rFonts w:ascii="Consolas" w:cs="Consolas" w:eastAsia="Consolas" w:hAnsi="Consolas"/>
+          <w:color w:val="1F6E56"/>
+          <w:sz w:val="20"/>
+          <w:szCs w:val="20"/>
+        </w:rPr>
+        <w:t xml:space="preserve">transition</w:t>
+      </w:r>
+      <w:r>
+        <w:t xml:space="preserve"> makes the change smooth. It tells visitors straight away that the picture can be clicked. You can see it on the family tree and photo gallery on the Explorer page and in every plant gallery.</w:t>
       </w:r>
     </w:p>
     <w:p>
@@ -2212,7 +2820,7 @@
         <w:pStyle w:val="Heading3"/>
       </w:pPr>
       <w:r>
-        <w:t xml:space="preserve">Enhancement 4: Flip cards</w:t>
+        <w:t xml:space="preserve">7. Button and link hover effects</w:t>
       </w:r>
     </w:p>
     <w:p>
@@ -2220,51 +2828,39 @@
         <w:spacing w:after="140" w:line="300"/>
       </w:pPr>
       <w:r>
-        <w:t xml:space="preserve">Flip cards show a plant photo on the front. When you move the mouse over one, or reach it with the keyboard, it turns over in 3D to reveal a fun fact and a link. The card gets depth from </w:t>
-      </w:r>
-      <w:r>
-        <w:rPr>
-          <w:rFonts w:ascii="Consolas" w:cs="Consolas" w:eastAsia="Consolas" w:hAnsi="Consolas"/>
-          <w:color w:val="1F6E56"/>
-          <w:sz w:val="20"/>
-          <w:szCs w:val="20"/>
-        </w:rPr>
-        <w:t xml:space="preserve">perspective</w:t>
-      </w:r>
-      <w:r>
-        <w:t xml:space="preserve">, the inner part rotates with </w:t>
-      </w:r>
-      <w:r>
-        <w:rPr>
-          <w:rFonts w:ascii="Consolas" w:cs="Consolas" w:eastAsia="Consolas" w:hAnsi="Consolas"/>
-          <w:color w:val="1F6E56"/>
-          <w:sz w:val="20"/>
-          <w:szCs w:val="20"/>
-        </w:rPr>
-        <w:t xml:space="preserve">rotateY(180deg)</w:t>
-      </w:r>
-      <w:r>
-        <w:t xml:space="preserve">, and </w:t>
-      </w:r>
-      <w:r>
-        <w:rPr>
-          <w:rFonts w:ascii="Consolas" w:cs="Consolas" w:eastAsia="Consolas" w:hAnsi="Consolas"/>
-          <w:color w:val="1F6E56"/>
-          <w:sz w:val="20"/>
-          <w:szCs w:val="20"/>
-        </w:rPr>
-        <w:t xml:space="preserve">backface-visibility: hidden</w:t>
-      </w:r>
-      <w:r>
-        <w:t xml:space="preserve"> makes sure you only ever see one side at a time.</w:t>
-      </w:r>
-    </w:p>
-    <w:p>
-      <w:pPr>
-        <w:pStyle w:val="Heading2"/>
-      </w:pPr>
-      <w:r>
-        <w:t xml:space="preserve">4.3 Other enhancements</w:t>
+        <w:t xml:space="preserve">Every button, such as “Start exploring”, “Identify” and “Submit”, changes colour, lifts up slightly and gains a shadow when you point at it. Links in the text are bold with a thick mint underline and light up on hover. Links that lead to another page also end with a small arrow that nudges forward. The arrow is added with the </w:t>
+      </w:r>
+      <w:r>
+        <w:rPr>
+          <w:rFonts w:ascii="Consolas" w:cs="Consolas" w:eastAsia="Consolas" w:hAnsi="Consolas"/>
+          <w:color w:val="1F6E56"/>
+          <w:sz w:val="20"/>
+          <w:szCs w:val="20"/>
+        </w:rPr>
+        <w:t xml:space="preserve">::after</w:t>
+      </w:r>
+      <w:r>
+        <w:t xml:space="preserve"> pseudo-element, and the attribute selector </w:t>
+      </w:r>
+      <w:r>
+        <w:rPr>
+          <w:rFonts w:ascii="Consolas" w:cs="Consolas" w:eastAsia="Consolas" w:hAnsi="Consolas"/>
+          <w:color w:val="1F6E56"/>
+          <w:sz w:val="20"/>
+          <w:szCs w:val="20"/>
+        </w:rPr>
+        <w:t xml:space="preserve">a[href$=".html"]</w:t>
+      </w:r>
+      <w:r>
+        <w:t xml:space="preserve"> makes sure only links to other pages get one, not links within the same page. This makes it clear what is clickable and where it will take you.</w:t>
+      </w:r>
+    </w:p>
+    <w:p>
+      <w:pPr>
+        <w:pStyle w:val="Heading3"/>
+      </w:pPr>
+      <w:r>
+        <w:t xml:space="preserve">8. Back to top button</w:t>
       </w:r>
     </w:p>
     <w:p>
@@ -2272,7 +2868,489 @@
         <w:spacing w:after="140" w:line="300"/>
       </w:pPr>
       <w:r>
-        <w:t xml:space="preserve">Beyond the main four, the site has fourteen more enhancements. They include a star rating, picture and link hover effects, a Back to top button, the Google Map, CSS animations, expandable care tips, live form feedback, a site-map footer, search suggestions, phone-friendly pages, the link map diagram, the family comparison chart and custom fonts with the branded header. Each one is explained on the Enhancements page.</w:t>
+        <w:t xml:space="preserve">A round ↑ button sits in the bottom-right corner of every page. Clicking it takes you back to the top of the page. It uses </w:t>
+      </w:r>
+      <w:r>
+        <w:rPr>
+          <w:rFonts w:ascii="Consolas" w:cs="Consolas" w:eastAsia="Consolas" w:hAnsi="Consolas"/>
+          <w:color w:val="1F6E56"/>
+          <w:sz w:val="20"/>
+          <w:szCs w:val="20"/>
+        </w:rPr>
+        <w:t xml:space="preserve">position: fixed</w:t>
+      </w:r>
+      <w:r>
+        <w:t xml:space="preserve"> so it stays in the same corner while you scroll, and </w:t>
+      </w:r>
+      <w:r>
+        <w:rPr>
+          <w:rFonts w:ascii="Consolas" w:cs="Consolas" w:eastAsia="Consolas" w:hAnsi="Consolas"/>
+          <w:color w:val="1F6E56"/>
+          <w:sz w:val="20"/>
+          <w:szCs w:val="20"/>
+        </w:rPr>
+        <w:t xml:space="preserve">scroll-behavior: smooth</w:t>
+      </w:r>
+      <w:r>
+        <w:t xml:space="preserve"> makes the page glide up instead of jumping. It is especially handy on the long Explorer pages.</w:t>
+      </w:r>
+    </w:p>
+    <w:p>
+      <w:pPr>
+        <w:pStyle w:val="Heading3"/>
+      </w:pPr>
+      <w:r>
+        <w:t xml:space="preserve">9. Google Map</w:t>
+      </w:r>
+    </w:p>
+    <w:p>
+      <w:pPr>
+        <w:spacing w:after="140" w:line="300"/>
+      </w:pPr>
+      <w:r>
+        <w:t xml:space="preserve">The Identify page includes an embedded Google Map showing where the example plant grows. It is added with an </w:t>
+      </w:r>
+      <w:r>
+        <w:rPr>
+          <w:rFonts w:ascii="Consolas" w:cs="Consolas" w:eastAsia="Consolas" w:hAnsi="Consolas"/>
+          <w:color w:val="1F6E56"/>
+          <w:sz w:val="20"/>
+          <w:szCs w:val="20"/>
+        </w:rPr>
+        <w:t xml:space="preserve">&lt;iframe&gt;</w:t>
+      </w:r>
+      <w:r>
+        <w:t xml:space="preserve"> inside a box that stretches to the full width of the page, so the map also fits neatly on a phone. This is the kind of embedded external content the brief suggests as an enhancement.</w:t>
+      </w:r>
+    </w:p>
+    <w:p>
+      <w:pPr>
+        <w:pStyle w:val="Heading3"/>
+      </w:pPr>
+      <w:r>
+        <w:t xml:space="preserve">10. CSS animations</w:t>
+      </w:r>
+    </w:p>
+    <w:p>
+      <w:pPr>
+        <w:spacing w:after="140" w:line="300"/>
+      </w:pPr>
+      <w:r>
+        <w:t xml:space="preserve">The site uses six </w:t>
+      </w:r>
+      <w:r>
+        <w:rPr>
+          <w:rFonts w:ascii="Consolas" w:cs="Consolas" w:eastAsia="Consolas" w:hAnsi="Consolas"/>
+          <w:color w:val="1F6E56"/>
+          <w:sz w:val="20"/>
+          <w:szCs w:val="20"/>
+        </w:rPr>
+        <w:t xml:space="preserve">@keyframes</w:t>
+      </w:r>
+      <w:r>
+        <w:t xml:space="preserve"> animations. On the Home page banner, the heading rises in one word at a time, and the line “Help us ___ Malaysia’s plants” keeps changing between explore, identify, record and protect. Across the site, headings, cards and form sections fade up gently as a page opens, a soft glow pulses around the logo, the tree logo sways when you point at it, and the Identify button gently pulses to draw attention. A </w:t>
+      </w:r>
+      <w:r>
+        <w:rPr>
+          <w:rFonts w:ascii="Consolas" w:cs="Consolas" w:eastAsia="Consolas" w:hAnsi="Consolas"/>
+          <w:color w:val="1F6E56"/>
+          <w:sz w:val="20"/>
+          <w:szCs w:val="20"/>
+        </w:rPr>
+        <w:t xml:space="preserve">prefers-reduced-motion</w:t>
+      </w:r>
+      <w:r>
+        <w:t xml:space="preserve"> rule switches all of this off for anyone who has asked their device for less movement.</w:t>
+      </w:r>
+    </w:p>
+    <w:p>
+      <w:pPr>
+        <w:pStyle w:val="Heading3"/>
+      </w:pPr>
+      <w:r>
+        <w:t xml:space="preserve">11. Expandable care tips and quiz answers</w:t>
+      </w:r>
+    </w:p>
+    <w:p>
+      <w:pPr>
+        <w:spacing w:after="140" w:line="300"/>
+      </w:pPr>
+      <w:r>
+        <w:t xml:space="preserve">On the Identify page, the care tips for the example plant sit inside a box that opens and closes with one click, which keeps the result short and tidy. The quiz on the Explorer page works the same way, with each answer hidden until you choose to reveal it. Both use the HTML5 </w:t>
+      </w:r>
+      <w:r>
+        <w:rPr>
+          <w:rFonts w:ascii="Consolas" w:cs="Consolas" w:eastAsia="Consolas" w:hAnsi="Consolas"/>
+          <w:color w:val="1F6E56"/>
+          <w:sz w:val="20"/>
+          <w:szCs w:val="20"/>
+        </w:rPr>
+        <w:t xml:space="preserve">&lt;details&gt;</w:t>
+      </w:r>
+      <w:r>
+        <w:t xml:space="preserve"> and </w:t>
+      </w:r>
+      <w:r>
+        <w:rPr>
+          <w:rFonts w:ascii="Consolas" w:cs="Consolas" w:eastAsia="Consolas" w:hAnsi="Consolas"/>
+          <w:color w:val="1F6E56"/>
+          <w:sz w:val="20"/>
+          <w:szCs w:val="20"/>
+        </w:rPr>
+        <w:t xml:space="preserve">&lt;summary&gt;</w:t>
+      </w:r>
+      <w:r>
+        <w:t xml:space="preserve"> elements, which need no JavaScript.</w:t>
+      </w:r>
+    </w:p>
+    <w:p>
+      <w:pPr>
+        <w:pStyle w:val="Heading3"/>
+      </w:pPr>
+      <w:r>
+        <w:t xml:space="preserve">12. Live form feedback</w:t>
+      </w:r>
+    </w:p>
+    <w:p>
+      <w:pPr>
+        <w:spacing w:after="140" w:line="300"/>
+      </w:pPr>
+      <w:r>
+        <w:t xml:space="preserve">As you fill in the contribution and enquiry forms, each field’s border turns red while the entry is not right yet and green once it is. This uses the </w:t>
+      </w:r>
+      <w:r>
+        <w:rPr>
+          <w:rFonts w:ascii="Consolas" w:cs="Consolas" w:eastAsia="Consolas" w:hAnsi="Consolas"/>
+          <w:color w:val="1F6E56"/>
+          <w:sz w:val="20"/>
+          <w:szCs w:val="20"/>
+        </w:rPr>
+        <w:t xml:space="preserve">:invalid</w:t>
+      </w:r>
+      <w:r>
+        <w:t xml:space="preserve"> and </w:t>
+      </w:r>
+      <w:r>
+        <w:rPr>
+          <w:rFonts w:ascii="Consolas" w:cs="Consolas" w:eastAsia="Consolas" w:hAnsi="Consolas"/>
+          <w:color w:val="1F6E56"/>
+          <w:sz w:val="20"/>
+          <w:szCs w:val="20"/>
+        </w:rPr>
+        <w:t xml:space="preserve">:valid</w:t>
+      </w:r>
+      <w:r>
+        <w:t xml:space="preserve"> selectors, together with the rules already set in the HTML, such as </w:t>
+      </w:r>
+      <w:r>
+        <w:rPr>
+          <w:rFonts w:ascii="Consolas" w:cs="Consolas" w:eastAsia="Consolas" w:hAnsi="Consolas"/>
+          <w:color w:val="1F6E56"/>
+          <w:sz w:val="20"/>
+          <w:szCs w:val="20"/>
+        </w:rPr>
+        <w:t xml:space="preserve">required</w:t>
+      </w:r>
+      <w:r>
+        <w:t xml:space="preserve">, </w:t>
+      </w:r>
+      <w:r>
+        <w:rPr>
+          <w:rFonts w:ascii="Consolas" w:cs="Consolas" w:eastAsia="Consolas" w:hAnsi="Consolas"/>
+          <w:color w:val="1F6E56"/>
+          <w:sz w:val="20"/>
+          <w:szCs w:val="20"/>
+        </w:rPr>
+        <w:t xml:space="preserve">maxlength</w:t>
+      </w:r>
+      <w:r>
+        <w:t xml:space="preserve"> and </w:t>
+      </w:r>
+      <w:r>
+        <w:rPr>
+          <w:rFonts w:ascii="Consolas" w:cs="Consolas" w:eastAsia="Consolas" w:hAnsi="Consolas"/>
+          <w:color w:val="1F6E56"/>
+          <w:sz w:val="20"/>
+          <w:szCs w:val="20"/>
+        </w:rPr>
+        <w:t xml:space="preserve">pattern</w:t>
+      </w:r>
+      <w:r>
+        <w:t xml:space="preserve">. The </w:t>
+      </w:r>
+      <w:r>
+        <w:rPr>
+          <w:rFonts w:ascii="Consolas" w:cs="Consolas" w:eastAsia="Consolas" w:hAnsi="Consolas"/>
+          <w:color w:val="1F6E56"/>
+          <w:sz w:val="20"/>
+          <w:szCs w:val="20"/>
+        </w:rPr>
+        <w:t xml:space="preserve">:focus-within</w:t>
+      </w:r>
+      <w:r>
+        <w:t xml:space="preserve"> selector also highlights the whole section you are working on. People can see and fix mistakes as they go, instead of finding out only when they press Submit.</w:t>
+      </w:r>
+    </w:p>
+    <w:p>
+      <w:pPr>
+        <w:pStyle w:val="Heading3"/>
+      </w:pPr>
+      <w:r>
+        <w:t xml:space="preserve">13. Site-map footer</w:t>
+      </w:r>
+    </w:p>
+    <w:p>
+      <w:pPr>
+        <w:spacing w:after="140" w:line="300"/>
+      </w:pPr>
+      <w:r>
+        <w:t xml:space="preserve">Every page ends with a footer that doubles as a site map. It has the mission line “Every photo helps protect a plant”, five columns of links to every part of the website, and a bottom bar with credits and a Back to top link. CSS grid lets the columns rearrange themselves to fit the screen, a wavy edge along the top is drawn with a </w:t>
+      </w:r>
+      <w:r>
+        <w:rPr>
+          <w:rFonts w:ascii="Consolas" w:cs="Consolas" w:eastAsia="Consolas" w:hAnsi="Consolas"/>
+          <w:color w:val="1F6E56"/>
+          <w:sz w:val="20"/>
+          <w:szCs w:val="20"/>
+        </w:rPr>
+        <w:t xml:space="preserve">radial-gradient</w:t>
+      </w:r>
+      <w:r>
+        <w:t xml:space="preserve">, and each link grows an underline from the centre when you point at it.</w:t>
+      </w:r>
+    </w:p>
+    <w:p>
+      <w:pPr>
+        <w:pStyle w:val="Heading3"/>
+      </w:pPr>
+      <w:r>
+        <w:t xml:space="preserve">14. Site search with suggestions</w:t>
+      </w:r>
+    </w:p>
+    <w:p>
+      <w:pPr>
+        <w:spacing w:after="140" w:line="300"/>
+      </w:pPr>
+      <w:r>
+        <w:t xml:space="preserve">Every page has a search box in the header. As you type, it suggests plant names and pages, such as </w:t>
+      </w:r>
+      <w:r>
+        <w:rPr>
+          <w:i/>
+          <w:iCs/>
+        </w:rPr>
+        <w:t xml:space="preserve">Cryptocarya alba</w:t>
+      </w:r>
+      <w:r>
+        <w:t xml:space="preserve"> or “Contribution form”, using the HTML5 </w:t>
+      </w:r>
+      <w:r>
+        <w:rPr>
+          <w:rFonts w:ascii="Consolas" w:cs="Consolas" w:eastAsia="Consolas" w:hAnsi="Consolas"/>
+          <w:color w:val="1F6E56"/>
+          <w:sz w:val="20"/>
+          <w:szCs w:val="20"/>
+        </w:rPr>
+        <w:t xml:space="preserve">&lt;datalist&gt;</w:t>
+      </w:r>
+      <w:r>
+        <w:t xml:space="preserve"> element. The box is a white rounded shape with a mint Search button inside. When you click into it, it widens and glows mint, thanks to the </w:t>
+      </w:r>
+      <w:r>
+        <w:rPr>
+          <w:rFonts w:ascii="Consolas" w:cs="Consolas" w:eastAsia="Consolas" w:hAnsi="Consolas"/>
+          <w:color w:val="1F6E56"/>
+          <w:sz w:val="20"/>
+          <w:szCs w:val="20"/>
+        </w:rPr>
+        <w:t xml:space="preserve">:focus-within</w:t>
+      </w:r>
+      <w:r>
+        <w:t xml:space="preserve"> selector and a transition. Even the small magnifying glass is drawn with CSS pseudo-elements rather than an image.</w:t>
+      </w:r>
+    </w:p>
+    <w:p>
+      <w:pPr>
+        <w:pStyle w:val="Heading3"/>
+      </w:pPr>
+      <w:r>
+        <w:t xml:space="preserve">15. Phone-friendly pages</w:t>
+      </w:r>
+    </w:p>
+    <w:p>
+      <w:pPr>
+        <w:spacing w:after="140" w:line="300"/>
+      </w:pPr>
+      <w:r>
+        <w:t xml:space="preserve">A separate phone stylesheet, </w:t>
+      </w:r>
+      <w:r>
+        <w:rPr>
+          <w:rFonts w:ascii="Consolas" w:cs="Consolas" w:eastAsia="Consolas" w:hAnsi="Consolas"/>
+          <w:color w:val="1F6E56"/>
+          <w:sz w:val="20"/>
+          <w:szCs w:val="20"/>
+        </w:rPr>
+        <w:t xml:space="preserve">mobile.css</w:t>
+      </w:r>
+      <w:r>
+        <w:t xml:space="preserve">, takes over on screens 700 pixels wide or narrower. It moves the search box below the logo, slims down the menu bar, stacks the quick facts and side notes into a single column, and turns the link map into a simple indented list. Wide tables can be swiped sideways, and their caption tells you so. The Back to top button gets smaller, and form buttons stretch out so they are easier to tap. The forms also use </w:t>
+      </w:r>
+      <w:r>
+        <w:rPr>
+          <w:rFonts w:ascii="Consolas" w:cs="Consolas" w:eastAsia="Consolas" w:hAnsi="Consolas"/>
+          <w:color w:val="1F6E56"/>
+          <w:sz w:val="20"/>
+          <w:szCs w:val="20"/>
+        </w:rPr>
+        <w:t xml:space="preserve">type="email"</w:t>
+      </w:r>
+      <w:r>
+        <w:t xml:space="preserve">, </w:t>
+      </w:r>
+      <w:r>
+        <w:rPr>
+          <w:rFonts w:ascii="Consolas" w:cs="Consolas" w:eastAsia="Consolas" w:hAnsi="Consolas"/>
+          <w:color w:val="1F6E56"/>
+          <w:sz w:val="20"/>
+          <w:szCs w:val="20"/>
+        </w:rPr>
+        <w:t xml:space="preserve">type="tel"</w:t>
+      </w:r>
+      <w:r>
+        <w:t xml:space="preserve"> and </w:t>
+      </w:r>
+      <w:r>
+        <w:rPr>
+          <w:rFonts w:ascii="Consolas" w:cs="Consolas" w:eastAsia="Consolas" w:hAnsi="Consolas"/>
+          <w:color w:val="1F6E56"/>
+          <w:sz w:val="20"/>
+          <w:szCs w:val="20"/>
+        </w:rPr>
+        <w:t xml:space="preserve">type="date"</w:t>
+      </w:r>
+      <w:r>
+        <w:t xml:space="preserve">, so phones show the right keyboard or a calendar.</w:t>
+      </w:r>
+    </w:p>
+    <w:p>
+      <w:pPr>
+        <w:pStyle w:val="Heading3"/>
+      </w:pPr>
+      <w:r>
+        <w:t xml:space="preserve">16. Link map diagram</w:t>
+      </w:r>
+    </w:p>
+    <w:p>
+      <w:pPr>
+        <w:spacing w:after="140" w:line="300"/>
+      </w:pPr>
+      <w:r>
+        <w:t xml:space="preserve">The Explorer page draws a tree diagram that links both families to their genera and species. Behind the scenes it is just a nested list, which keeps the HTML simple and meaningful. The connecting lines are drawn with the </w:t>
+      </w:r>
+      <w:r>
+        <w:rPr>
+          <w:rFonts w:ascii="Consolas" w:cs="Consolas" w:eastAsia="Consolas" w:hAnsi="Consolas"/>
+          <w:color w:val="1F6E56"/>
+          <w:sz w:val="20"/>
+          <w:szCs w:val="20"/>
+        </w:rPr>
+        <w:t xml:space="preserve">::before</w:t>
+      </w:r>
+      <w:r>
+        <w:t xml:space="preserve"> and </w:t>
+      </w:r>
+      <w:r>
+        <w:rPr>
+          <w:rFonts w:ascii="Consolas" w:cs="Consolas" w:eastAsia="Consolas" w:hAnsi="Consolas"/>
+          <w:color w:val="1F6E56"/>
+          <w:sz w:val="20"/>
+          <w:szCs w:val="20"/>
+        </w:rPr>
+        <w:t xml:space="preserve">::after</w:t>
+      </w:r>
+      <w:r>
+        <w:t xml:space="preserve"> pseudo-elements, and each box links to that plant’s section. On a phone, the diagram turns into an indented list that is easier to read on a small screen.</w:t>
+      </w:r>
+    </w:p>
+    <w:p>
+      <w:pPr>
+        <w:pStyle w:val="Heading3"/>
+      </w:pPr>
+      <w:r>
+        <w:t xml:space="preserve">17. Family comparison chart</w:t>
+      </w:r>
+    </w:p>
+    <w:p>
+      <w:pPr>
+        <w:spacing w:after="140" w:line="300"/>
+      </w:pPr>
+      <w:r>
+        <w:t xml:space="preserve">A side-by-side chart on the Explorer page compares the two families: their fruit, leaves, smell, size, seeds, range and uses. Each family has its own colour bar at the top, every second row is shaded with </w:t>
+      </w:r>
+      <w:r>
+        <w:rPr>
+          <w:rFonts w:ascii="Consolas" w:cs="Consolas" w:eastAsia="Consolas" w:hAnsi="Consolas"/>
+          <w:color w:val="1F6E56"/>
+          <w:sz w:val="20"/>
+          <w:szCs w:val="20"/>
+        </w:rPr>
+        <w:t xml:space="preserve">:nth-child(even)</w:t>
+      </w:r>
+      <w:r>
+        <w:t xml:space="preserve">, and the row you point at lights up, so it is easy to read across. It turns a long list of differences into something you can take in at a glance.</w:t>
+      </w:r>
+    </w:p>
+    <w:p>
+      <w:pPr>
+        <w:pStyle w:val="Heading3"/>
+      </w:pPr>
+      <w:r>
+        <w:t xml:space="preserve">18. Custom fonts and branded header</w:t>
+      </w:r>
+    </w:p>
+    <w:p>
+      <w:pPr>
+        <w:spacing w:after="140" w:line="300"/>
+      </w:pPr>
+      <w:r>
+        <w:t xml:space="preserve">The site uses three free Google Fonts, linked at the top of the stylesheet with </w:t>
+      </w:r>
+      <w:r>
+        <w:rPr>
+          <w:rFonts w:ascii="Consolas" w:cs="Consolas" w:eastAsia="Consolas" w:hAnsi="Consolas"/>
+          <w:color w:val="1F6E56"/>
+          <w:sz w:val="20"/>
+          <w:szCs w:val="20"/>
+        </w:rPr>
+        <w:t xml:space="preserve">@import</w:t>
+      </w:r>
+      <w:r>
+        <w:t xml:space="preserve">. Playfair Display is used for the site name and page titles, Lora for the section and plant headings, and Source Sans 3 for the main text. Each font has a safe backup, such as Georgia or Arial. The header fades from mint to teal behind faint leaves and grid lines, using a </w:t>
+      </w:r>
+      <w:r>
+        <w:rPr>
+          <w:rFonts w:ascii="Consolas" w:cs="Consolas" w:eastAsia="Consolas" w:hAnsi="Consolas"/>
+          <w:color w:val="1F6E56"/>
+          <w:sz w:val="20"/>
+          <w:szCs w:val="20"/>
+        </w:rPr>
+        <w:t xml:space="preserve">linear-gradient</w:t>
+      </w:r>
+      <w:r>
+        <w:t xml:space="preserve"> under a background image. It shows the name in two colours with a mint “@”, a “Family · Genera · Species” pill that links to the Explorer, and the slogan “Know it. Name it. Save it.” A gradient line drawn with </w:t>
+      </w:r>
+      <w:r>
+        <w:rPr>
+          <w:rFonts w:ascii="Consolas" w:cs="Consolas" w:eastAsia="Consolas" w:hAnsi="Consolas"/>
+          <w:color w:val="1F6E56"/>
+          <w:sz w:val="20"/>
+          <w:szCs w:val="20"/>
+        </w:rPr>
+        <w:t xml:space="preserve">::after</w:t>
+      </w:r>
+      <w:r>
+        <w:t xml:space="preserve"> finishes it off along the bottom. Together, these give the site its own recognisable look.</w:t>
       </w:r>
     </w:p>
     <w:p>

</xml_diff>